<commit_message>
new implementation for sending queue
</commit_message>
<xml_diff>
--- a/project1 notes.docx
+++ b/project1 notes.docx
@@ -521,7 +521,7 @@
         <w:pStyle w:val="a9"/>
         <w:numPr>
           <w:ilvl w:val="0"/>
-          <w:numId w:val="6"/>
+          <w:numId w:val="7"/>
         </w:numPr>
         <w:rPr>
           <w:rFonts w:ascii="Times New Roman" w:hAnsi="Times New Roman" w:cs="Times New Roman"/>
@@ -533,38 +533,38 @@
           <w:rFonts w:ascii="Times New Roman" w:hAnsi="Times New Roman" w:cs="Times New Roman"/>
           <w:sz w:val="24"/>
         </w:rPr>
-        <w:t>Sync message is corrupted</w:t>
-      </w:r>
-    </w:p>
-    <w:p>
-      <w:pPr>
-        <w:pStyle w:val="a9"/>
-        <w:numPr>
-          <w:ilvl w:val="0"/>
-          <w:numId w:val="6"/>
-        </w:numPr>
-        <w:rPr>
-          <w:rFonts w:ascii="Times New Roman" w:hAnsi="Times New Roman" w:cs="Times New Roman"/>
-          <w:sz w:val="24"/>
-        </w:rPr>
-      </w:pPr>
-      <w:r>
-        <w:rPr>
-          <w:rFonts w:ascii="Times New Roman" w:hAnsi="Times New Roman" w:cs="Times New Roman"/>
-          <w:sz w:val="24"/>
-        </w:rPr>
-        <w:t>Don’t send ack for sync-ack</w:t>
-      </w:r>
-    </w:p>
-    <w:p>
-      <w:pPr>
-        <w:widowControl/>
-        <w:jc w:val="left"/>
-        <w:rPr>
-          <w:rFonts w:ascii="Times New Roman" w:hAnsi="Times New Roman" w:cs="Times New Roman"/>
-          <w:sz w:val="24"/>
-        </w:rPr>
-      </w:pPr>
+        <w:t xml:space="preserve">Payload </w:t>
+      </w:r>
+      <w:proofErr w:type="spellStart"/>
+      <w:r>
+        <w:rPr>
+          <w:rFonts w:ascii="Times New Roman" w:hAnsi="Times New Roman" w:cs="Times New Roman"/>
+          <w:sz w:val="24"/>
+        </w:rPr>
+        <w:t>handhskae</w:t>
+      </w:r>
+      <w:proofErr w:type="spellEnd"/>
+      <w:r>
+        <w:rPr>
+          <w:rFonts w:ascii="Times New Roman" w:hAnsi="Times New Roman" w:cs="Times New Roman"/>
+          <w:sz w:val="24"/>
+        </w:rPr>
+        <w:t xml:space="preserve"> packet not setting </w:t>
+      </w:r>
+      <w:r>
+        <w:rPr>
+          <w:rFonts w:ascii="Times New Roman" w:hAnsi="Times New Roman" w:cs="Times New Roman"/>
+          <w:sz w:val="24"/>
+        </w:rPr>
+        <w:t>ack</w:t>
+      </w:r>
+      <w:r>
+        <w:rPr>
+          <w:rFonts w:ascii="Times New Roman" w:hAnsi="Times New Roman" w:cs="Times New Roman"/>
+          <w:sz w:val="24"/>
+        </w:rPr>
+        <w:t xml:space="preserve"> flag</w:t>
+      </w:r>
       <w:r>
         <w:rPr>
           <w:rFonts w:ascii="Times New Roman" w:hAnsi="Times New Roman" w:cs="Times New Roman"/>
@@ -737,14 +737,7 @@
           <w:rFonts w:ascii="Times New Roman" w:hAnsi="Times New Roman" w:cs="Times New Roman"/>
           <w:sz w:val="24"/>
         </w:rPr>
-        <w:t>origin</w:t>
-      </w:r>
-      <w:r>
-        <w:rPr>
-          <w:rFonts w:ascii="Times New Roman" w:hAnsi="Times New Roman" w:cs="Times New Roman"/>
-          <w:sz w:val="24"/>
-        </w:rPr>
-        <w:t>ally</w:t>
+        <w:t>originally</w:t>
       </w:r>
       <w:proofErr w:type="gramEnd"/>
       <w:r>
@@ -753,6 +746,156 @@
           <w:sz w:val="24"/>
         </w:rPr>
         <w:t xml:space="preserve"> we either only set parity bit from 0 to 1 or 1 to 0. Not flipping</w:t>
+      </w:r>
+    </w:p>
+    <w:p>
+      <w:pPr>
+        <w:pStyle w:val="a9"/>
+        <w:numPr>
+          <w:ilvl w:val="0"/>
+          <w:numId w:val="5"/>
+        </w:numPr>
+        <w:rPr>
+          <w:rFonts w:ascii="Times New Roman" w:hAnsi="Times New Roman" w:cs="Times New Roman"/>
+          <w:sz w:val="24"/>
+        </w:rPr>
+      </w:pPr>
+      <w:r>
+        <w:rPr>
+          <w:rFonts w:ascii="Times New Roman" w:hAnsi="Times New Roman" w:cs="Times New Roman"/>
+          <w:sz w:val="24"/>
+        </w:rPr>
+        <w:t>The sync packet is not enqueued.</w:t>
+      </w:r>
+    </w:p>
+    <w:p>
+      <w:pPr>
+        <w:pStyle w:val="a9"/>
+        <w:numPr>
+          <w:ilvl w:val="0"/>
+          <w:numId w:val="5"/>
+        </w:numPr>
+        <w:rPr>
+          <w:rFonts w:ascii="Times New Roman" w:hAnsi="Times New Roman" w:cs="Times New Roman"/>
+          <w:sz w:val="24"/>
+        </w:rPr>
+      </w:pPr>
+      <w:r>
+        <w:rPr>
+          <w:rFonts w:ascii="Times New Roman" w:hAnsi="Times New Roman" w:cs="Times New Roman"/>
+          <w:sz w:val="24"/>
+        </w:rPr>
+        <w:t xml:space="preserve">Even if packet is </w:t>
+      </w:r>
+      <w:proofErr w:type="spellStart"/>
+      <w:r>
+        <w:rPr>
+          <w:rFonts w:ascii="Times New Roman" w:hAnsi="Times New Roman" w:cs="Times New Roman"/>
+          <w:sz w:val="24"/>
+        </w:rPr>
+        <w:t>enqueded</w:t>
+      </w:r>
+      <w:proofErr w:type="spellEnd"/>
+      <w:r>
+        <w:rPr>
+          <w:rFonts w:ascii="Times New Roman" w:hAnsi="Times New Roman" w:cs="Times New Roman"/>
+          <w:sz w:val="24"/>
+        </w:rPr>
+        <w:t xml:space="preserve"> before encoding, we still need to dequeue because it is a pointer reference</w:t>
+      </w:r>
+    </w:p>
+    <w:p>
+      <w:pPr>
+        <w:pStyle w:val="a9"/>
+        <w:numPr>
+          <w:ilvl w:val="0"/>
+          <w:numId w:val="5"/>
+        </w:numPr>
+        <w:rPr>
+          <w:rFonts w:ascii="Times New Roman" w:hAnsi="Times New Roman" w:cs="Times New Roman"/>
+          <w:sz w:val="24"/>
+        </w:rPr>
+      </w:pPr>
+      <w:r>
+        <w:rPr>
+          <w:rFonts w:ascii="Times New Roman" w:hAnsi="Times New Roman" w:cs="Times New Roman"/>
+          <w:sz w:val="24"/>
+        </w:rPr>
+        <w:t>Only update input if ack flag is set</w:t>
+      </w:r>
+    </w:p>
+    <w:p>
+      <w:pPr>
+        <w:pStyle w:val="a9"/>
+        <w:numPr>
+          <w:ilvl w:val="0"/>
+          <w:numId w:val="5"/>
+        </w:numPr>
+        <w:rPr>
+          <w:rFonts w:ascii="Times New Roman" w:hAnsi="Times New Roman" w:cs="Times New Roman"/>
+          <w:sz w:val="24"/>
+        </w:rPr>
+      </w:pPr>
+      <w:r>
+        <w:rPr>
+          <w:rFonts w:ascii="Times New Roman" w:hAnsi="Times New Roman" w:cs="Times New Roman"/>
+          <w:sz w:val="24"/>
+        </w:rPr>
+        <w:t xml:space="preserve">Dangling pointer of receiving buffer. (Received packet is freed inside output and then later accessed using </w:t>
+      </w:r>
+      <w:proofErr w:type="spellStart"/>
+      <w:r>
+        <w:rPr>
+          <w:rFonts w:ascii="Times New Roman" w:hAnsi="Times New Roman" w:cs="Times New Roman"/>
+          <w:sz w:val="24"/>
+        </w:rPr>
+        <w:t>update_input</w:t>
+      </w:r>
+      <w:proofErr w:type="spellEnd"/>
+      <w:r>
+        <w:rPr>
+          <w:rFonts w:ascii="Times New Roman" w:hAnsi="Times New Roman" w:cs="Times New Roman"/>
+          <w:sz w:val="24"/>
+        </w:rPr>
+        <w:t>)</w:t>
+      </w:r>
+    </w:p>
+    <w:p>
+      <w:pPr>
+        <w:rPr>
+          <w:rFonts w:ascii="Times New Roman" w:hAnsi="Times New Roman" w:cs="Times New Roman"/>
+          <w:sz w:val="24"/>
+        </w:rPr>
+      </w:pPr>
+    </w:p>
+    <w:p>
+      <w:pPr>
+        <w:rPr>
+          <w:rFonts w:ascii="Times New Roman" w:hAnsi="Times New Roman" w:cs="Times New Roman"/>
+          <w:sz w:val="24"/>
+        </w:rPr>
+      </w:pPr>
+      <w:r>
+        <w:rPr>
+          <w:rFonts w:ascii="Times New Roman" w:hAnsi="Times New Roman" w:cs="Times New Roman"/>
+          <w:sz w:val="24"/>
+        </w:rPr>
+        <w:t>6/8</w:t>
+      </w:r>
+    </w:p>
+    <w:p>
+      <w:pPr>
+        <w:rPr>
+          <w:rFonts w:ascii="Times New Roman" w:hAnsi="Times New Roman" w:cs="Times New Roman"/>
+          <w:sz w:val="24"/>
+        </w:rPr>
+      </w:pPr>
+      <w:r>
+        <w:rPr>
+          <w:rFonts w:ascii="Times New Roman" w:hAnsi="Times New Roman" w:cs="Times New Roman"/>
+          <w:sz w:val="24"/>
+        </w:rPr>
+        <w:t>14/116</w:t>
       </w:r>
     </w:p>
     <w:sectPr>
@@ -857,6 +1000,95 @@
     </w:lvl>
   </w:abstractNum>
   <w:abstractNum w:abstractNumId="1" w15:restartNumberingAfterBreak="0">
+    <w:nsid w:val="1170182F"/>
+    <w:multiLevelType w:val="hybridMultilevel"/>
+    <w:tmpl w:val="F232F572"/>
+    <w:lvl w:ilvl="0" w:tplc="DE806200">
+      <w:start w:val="1"/>
+      <w:numFmt w:val="decimal"/>
+      <w:lvlText w:val="%1."/>
+      <w:lvlJc w:val="left"/>
+      <w:pPr>
+        <w:ind w:left="360" w:hanging="360"/>
+      </w:pPr>
+      <w:rPr>
+        <w:rFonts w:hint="default"/>
+      </w:rPr>
+    </w:lvl>
+    <w:lvl w:ilvl="1" w:tplc="04090019" w:tentative="1">
+      <w:start w:val="1"/>
+      <w:numFmt w:val="lowerLetter"/>
+      <w:lvlText w:val="%2)"/>
+      <w:lvlJc w:val="left"/>
+      <w:pPr>
+        <w:ind w:left="880" w:hanging="440"/>
+      </w:pPr>
+    </w:lvl>
+    <w:lvl w:ilvl="2" w:tplc="0409001B" w:tentative="1">
+      <w:start w:val="1"/>
+      <w:numFmt w:val="lowerRoman"/>
+      <w:lvlText w:val="%3."/>
+      <w:lvlJc w:val="right"/>
+      <w:pPr>
+        <w:ind w:left="1320" w:hanging="440"/>
+      </w:pPr>
+    </w:lvl>
+    <w:lvl w:ilvl="3" w:tplc="0409000F" w:tentative="1">
+      <w:start w:val="1"/>
+      <w:numFmt w:val="decimal"/>
+      <w:lvlText w:val="%4."/>
+      <w:lvlJc w:val="left"/>
+      <w:pPr>
+        <w:ind w:left="1760" w:hanging="440"/>
+      </w:pPr>
+    </w:lvl>
+    <w:lvl w:ilvl="4" w:tplc="04090019" w:tentative="1">
+      <w:start w:val="1"/>
+      <w:numFmt w:val="lowerLetter"/>
+      <w:lvlText w:val="%5)"/>
+      <w:lvlJc w:val="left"/>
+      <w:pPr>
+        <w:ind w:left="2200" w:hanging="440"/>
+      </w:pPr>
+    </w:lvl>
+    <w:lvl w:ilvl="5" w:tplc="0409001B" w:tentative="1">
+      <w:start w:val="1"/>
+      <w:numFmt w:val="lowerRoman"/>
+      <w:lvlText w:val="%6."/>
+      <w:lvlJc w:val="right"/>
+      <w:pPr>
+        <w:ind w:left="2640" w:hanging="440"/>
+      </w:pPr>
+    </w:lvl>
+    <w:lvl w:ilvl="6" w:tplc="0409000F" w:tentative="1">
+      <w:start w:val="1"/>
+      <w:numFmt w:val="decimal"/>
+      <w:lvlText w:val="%7."/>
+      <w:lvlJc w:val="left"/>
+      <w:pPr>
+        <w:ind w:left="3080" w:hanging="440"/>
+      </w:pPr>
+    </w:lvl>
+    <w:lvl w:ilvl="7" w:tplc="04090019" w:tentative="1">
+      <w:start w:val="1"/>
+      <w:numFmt w:val="lowerLetter"/>
+      <w:lvlText w:val="%8)"/>
+      <w:lvlJc w:val="left"/>
+      <w:pPr>
+        <w:ind w:left="3520" w:hanging="440"/>
+      </w:pPr>
+    </w:lvl>
+    <w:lvl w:ilvl="8" w:tplc="0409001B" w:tentative="1">
+      <w:start w:val="1"/>
+      <w:numFmt w:val="lowerRoman"/>
+      <w:lvlText w:val="%9."/>
+      <w:lvlJc w:val="right"/>
+      <w:pPr>
+        <w:ind w:left="3960" w:hanging="440"/>
+      </w:pPr>
+    </w:lvl>
+  </w:abstractNum>
+  <w:abstractNum w:abstractNumId="2" w15:restartNumberingAfterBreak="0">
     <w:nsid w:val="12236E56"/>
     <w:multiLevelType w:val="hybridMultilevel"/>
     <w:tmpl w:val="438E1996"/>
@@ -969,7 +1201,7 @@
       </w:rPr>
     </w:lvl>
   </w:abstractNum>
-  <w:abstractNum w:abstractNumId="2" w15:restartNumberingAfterBreak="0">
+  <w:abstractNum w:abstractNumId="3" w15:restartNumberingAfterBreak="0">
     <w:nsid w:val="221B2918"/>
     <w:multiLevelType w:val="hybridMultilevel"/>
     <w:tmpl w:val="1004E180"/>
@@ -1058,7 +1290,7 @@
       </w:pPr>
     </w:lvl>
   </w:abstractNum>
-  <w:abstractNum w:abstractNumId="3" w15:restartNumberingAfterBreak="0">
+  <w:abstractNum w:abstractNumId="4" w15:restartNumberingAfterBreak="0">
     <w:nsid w:val="2DC80A12"/>
     <w:multiLevelType w:val="hybridMultilevel"/>
     <w:tmpl w:val="47D62BA8"/>
@@ -1147,7 +1379,7 @@
       </w:pPr>
     </w:lvl>
   </w:abstractNum>
-  <w:abstractNum w:abstractNumId="4" w15:restartNumberingAfterBreak="0">
+  <w:abstractNum w:abstractNumId="5" w15:restartNumberingAfterBreak="0">
     <w:nsid w:val="4E7766AC"/>
     <w:multiLevelType w:val="hybridMultilevel"/>
     <w:tmpl w:val="6D90B3DA"/>
@@ -1236,7 +1468,7 @@
       </w:pPr>
     </w:lvl>
   </w:abstractNum>
-  <w:abstractNum w:abstractNumId="5" w15:restartNumberingAfterBreak="0">
+  <w:abstractNum w:abstractNumId="6" w15:restartNumberingAfterBreak="0">
     <w:nsid w:val="613A406C"/>
     <w:multiLevelType w:val="hybridMultilevel"/>
     <w:tmpl w:val="E73EF0D0"/>
@@ -1326,22 +1558,25 @@
     </w:lvl>
   </w:abstractNum>
   <w:num w:numId="1" w16cid:durableId="828443789">
+    <w:abstractNumId w:val="3"/>
+  </w:num>
+  <w:num w:numId="2" w16cid:durableId="2088964237">
+    <w:abstractNumId w:val="6"/>
+  </w:num>
+  <w:num w:numId="3" w16cid:durableId="618151430">
+    <w:abstractNumId w:val="5"/>
+  </w:num>
+  <w:num w:numId="4" w16cid:durableId="224147486">
     <w:abstractNumId w:val="2"/>
   </w:num>
-  <w:num w:numId="2" w16cid:durableId="2088964237">
-    <w:abstractNumId w:val="5"/>
-  </w:num>
-  <w:num w:numId="3" w16cid:durableId="618151430">
+  <w:num w:numId="5" w16cid:durableId="1423644661">
     <w:abstractNumId w:val="4"/>
-  </w:num>
-  <w:num w:numId="4" w16cid:durableId="224147486">
-    <w:abstractNumId w:val="1"/>
-  </w:num>
-  <w:num w:numId="5" w16cid:durableId="1423644661">
-    <w:abstractNumId w:val="3"/>
   </w:num>
   <w:num w:numId="6" w16cid:durableId="1558937000">
     <w:abstractNumId w:val="0"/>
+  </w:num>
+  <w:num w:numId="7" w16cid:durableId="1476685066">
+    <w:abstractNumId w:val="1"/>
   </w:num>
 </w:numbering>
 </file>

</xml_diff>